<commit_message>
docs(configuration-parties-evenements-01M4GCJ9): vérification après fusion (pgTAP 947/947, Jest 873/873)
Co-Authored-By: Claude Opus 5.5 <noreply@anthropic.com>
</commit_message>
<xml_diff>
--- a/docs/Mission-03-Configuration-parties-evenements.docx
+++ b/docs/Mission-03-Configuration-parties-evenements.docx
@@ -112,7 +112,7 @@
           <w:sz w:val="22"/>
           <w:szCs w:val="22"/>
         </w:rPr>
-        <w:t xml:space="preserve">les 13 lots de travail sont terminés et approuvés (12 octobre 2026). Les 48 opérations du contrat sont servies et le scénario de référence (48 transactions) se rejoue à l'identique sur une configuration construite par l'API. Il reste à accepter la mission et à fusionner les branches de travail.</w:t>
+        <w:t xml:space="preserve">les 13 lots de travail sont terminés et approuvés (12 octobre 2026). Les 48 opérations du contrat sont servies et le scénario de référence (48 transactions) se rejoue à l'identique sur une configuration construite par l'API. La mission a été acceptée puis fusionnée dans sa branche le 13 octobre 2026 ; les suites ont été rejouées avec succès après la fusion. Rien n'est encore publié sur le dépôt distant.</w:t>
       </w:r>
     </w:p>
     <w:p>
@@ -4192,7 +4192,7 @@
           <w:sz w:val="25"/>
           <w:szCs w:val="25"/>
         </w:rPr>
-        <w:t xml:space="preserve">Vérifications au 12 octobre 2026</w:t>
+        <w:t xml:space="preserve">Vérifications au 13 octobre 2026 (après fusion)</w:t>
       </w:r>
     </w:p>
     <w:tbl>
@@ -4790,7 +4790,7 @@
           <w:sz w:val="22"/>
           <w:szCs w:val="22"/>
         </w:rPr>
-        <w:t xml:space="preserve">Les 13 lots sont approuvés dans leurs branches de travail ; ils ne sont pas encore fusionnés dans la branche de la mission. La documentation du projet a été recalée sur le code livré le 12 octobre 2026.</w:t>
+        <w:t xml:space="preserve">Les 13 lots sont fusionnés dans la branche de la mission (fusion locale du 13 octobre 2026, non publiée). La documentation du projet a été recalée sur le code livré.</w:t>
       </w:r>
     </w:p>
     <w:p>

</xml_diff>